<commit_message>
Remove the siding penetration below north-east upper bedroom and add the appraisal award (2 windows at different sides of the property).
</commit_message>
<xml_diff>
--- a/Filings/Complaint_Lu_Hu_v_Fire_Insurance_Exchange_v2.docx
+++ b/Filings/Complaint_Lu_Hu_v_Fire_Insurance_Exchange_v2.docx
@@ -482,7 +482,18 @@
         <w:t xml:space="preserve">On August 9, 2024, Mary of Legacy contractor contacted Plaintiffs </w:t>
       </w:r>
       <w:r>
-        <w:t xml:space="preserve">to check whether recent storms has caused damage to the property and Plaintiffs discovered </w:t>
+        <w:t xml:space="preserve">to check whether recent storms </w:t>
+      </w:r>
+      <w:proofErr w:type="gramStart"/>
+      <w:r>
+        <w:t>has</w:t>
+      </w:r>
+      <w:proofErr w:type="gramEnd"/>
+      <w:r>
+        <w:t xml:space="preserve"> caused damage to the property and Plaintiffs discovered </w:t>
+      </w:r>
+      <w:r>
+        <w:t xml:space="preserve">multiple </w:t>
       </w:r>
       <w:r>
         <w:t>leaking window</w:t>
@@ -596,7 +607,25 @@
         <w:t>Third inspection (October 9, 2024).</w:t>
       </w:r>
       <w:r>
-        <w:t xml:space="preserve"> Defendant retained Prieve Engineering, LLC, and engineer Nathan Prieve inspected the property. The Prieve Engineering report (File #241008) documents dents, marks, and indentations across at least nineteen distinct windows, plus a sliding door, on the home, including the front/west triple window above the main entry, the upper-west three-unit bedroom window, the upper southwest bedroom window, the east family-room bay projection, the upper-east window above the four-season porch, the four-season porch southeast/east/northeast/north windows, the kitchen east window, the main-level northeast three-unit window, the upper-north window above the kitchen, and the rear/east garage window, together with a siding penetration below the upper northeast bedroom. The report's Photo Appendix A separately documents — in captions Prieve's own office created — dented downspouts at three elevations of the home (photographs A-42 at the front, A-91 through A-93 at the south side, and A-98 and A-99 at the east side), dents in flashing at the deck (photograph A-103), additional siding and trim board observations (photographs A-25, A-26, A-53, A-54, A-90, and A-148), and a dent with a scrape mark in the screen of a door window (photograph A-141). Notwithstanding this catalog of observed damage — including non-window damage Defendant had not asked the engineer to evaluate </w:t>
+        <w:t xml:space="preserve"> Defendant retained Prieve Engineering, LLC, and engineer Nathan Prieve inspected the property. The Prieve Engineering report (File #241008) documents dents, marks, and indentations across at least nineteen distinct windows, plus a sliding door, on the home, </w:t>
+      </w:r>
+      <w:r>
+        <w:rPr>
+          <w:highlight w:val="yellow"/>
+        </w:rPr>
+        <w:t>including the front/west triple window above the main entry, the upper-west three-unit bedroom window, the upper southwest bedroom window, the east family-room bay projection, the upper-east window above the four-season porch, the four-season porch southeast/east/northeast/north windows, the kitchen east window, the main-level northeast three-unit window, the upper-north window above the kitchen, and the rear/east garage window,</w:t>
+      </w:r>
+      <w:r>
+        <w:t xml:space="preserve"> </w:t>
+      </w:r>
+      <w:r>
+        <w:rPr>
+          <w:highlight w:val="red"/>
+        </w:rPr>
+        <w:t>together with a siding penetration below the upper northeast bedroom.</w:t>
+      </w:r>
+      <w:r>
+        <w:t xml:space="preserve"> The report's Photo Appendix A separately documents — in captions Prieve's own office created — dented downspouts at three elevations of the home (photographs A-42 at the front, A-91 through A-93 at the south side, and A-98 and A-99 at the east side), dents in flashing at the deck (photograph A-103), additional siding and trim board observations (photographs A-25, A-26, A-53, A-54, A-90, and A-148), and a dent with a scrape mark in the screen of a door window (photograph A-141). Notwithstanding this catalog of observed damage — including non-window damage Defendant had not asked the engineer to evaluate </w:t>
       </w:r>
       <w:r>
         <w:lastRenderedPageBreak/>
@@ -637,7 +666,16 @@
         <w:t>First denial (September 3, 2024).</w:t>
       </w:r>
       <w:r>
-        <w:t xml:space="preserve"> Five business days after the Hancock inspection and before any forensic engineer had been retained, Defendant denied the claim by phone and by formal written letter signed by Catastrophe Claims Representative Christian Dudley. The September 3, 2024 letter affirmatively stated that "interior water damage around your windows was observed. There were no other damages observed. There was no opening created by the direct force of wind or hail that could have occurred and allowed water to enter and cause immediate damage." That finding was contradicted three days later, on September 6, 2024, when Defendant's own adjuster Nicholas Brau personally observed dents on multiple windows and measured window dimensions.</w:t>
+        <w:t xml:space="preserve"> Five business days after the Hancock inspection and before </w:t>
+      </w:r>
+      <w:r>
+        <w:rPr>
+          <w:highlight w:val="yellow"/>
+        </w:rPr>
+        <w:t>any forensic engineer had been retained</w:t>
+      </w:r>
+      <w:r>
+        <w:t>, Defendant denied the claim by phone and by formal written letter signed by Catastrophe Claims Representative Christian Dudley. The September 3, 2024 letter affirmatively stated that "interior water damage around your windows was observed. There were no other damages observed. There was no opening created by the direct force of wind or hail that could have occurred and allowed water to enter and cause immediate damage." That finding was contradicted three days later, on September 6, 2024, when Defendant's own adjuster Nicholas Brau personally observed dents on multiple windows and measured window dimensions.</w:t>
       </w:r>
     </w:p>
     <w:p>
@@ -2147,7 +2185,16 @@
         <w:t>Statutory non-itemization — the $0 siding lines.</w:t>
       </w:r>
       <w:r>
-        <w:t xml:space="preserve"> The September 12, 2025 award lists two siding-related items at $0 Replacement Cost Value and $0 Actual Cash Value. The award does not identify which siding observations the panel evaluated; whether the panel evaluated the documented siding penetrations photographed at A-26, A-27, A-208, and A-212; whether the panel evaluated the documented trim board chips photographed at A-53 (which the Prieve report itself acknowledges is "visible in prior photo logs from Farmers Insurance dated October 13, 2020"), A-</w:t>
+        <w:t xml:space="preserve"> The September 12, 2025 award lists two siding-related items at $0 Replacement Cost Value and $0 Actual Cash Value. The award does not identify which siding observations the panel evaluated; whether the panel evaluated the documented siding penetrations photographed at </w:t>
+      </w:r>
+      <w:r>
+        <w:rPr>
+          <w:highlight w:val="red"/>
+        </w:rPr>
+        <w:t>A-26, A-27, A-208, and A-212;</w:t>
+      </w:r>
+      <w:r>
+        <w:t xml:space="preserve"> whether the panel evaluated the documented trim board chips photographed at A-53 (which the Prieve report itself acknowledges is "visible in prior photo logs from Farmers Insurance dated October 13, 2020"), A-</w:t>
       </w:r>
       <w:r>
         <w:lastRenderedPageBreak/>

</xml_diff>